<commit_message>
docs: Actualiza plan de migración, reemplazando la captura del modelo relacional por una versión más completa y detallada
</commit_message>
<xml_diff>
--- a/7_Trimestre/Documentación/Planes/Plan Migración Comunidad Inteligente.docx
+++ b/7_Trimestre/Documentación/Planes/Plan Migración Comunidad Inteligente.docx
@@ -1,6 +1,6 @@
 
 <file path=word/document.xml><?xml version="1.0" encoding="utf-8"?>
-<w:document xmlns:wpc="http://schemas.microsoft.com/office/word/2010/wordprocessingCanvas" xmlns:cx="http://schemas.microsoft.com/office/drawing/2014/chartex" xmlns:cx1="http://schemas.microsoft.com/office/drawing/2015/9/8/chartex" xmlns:cx2="http://schemas.microsoft.com/office/drawing/2015/10/21/chartex" xmlns:cx3="http://schemas.microsoft.com/office/drawing/2016/5/9/chartex" xmlns:cx4="http://schemas.microsoft.com/office/drawing/2016/5/10/chartex" xmlns:cx5="http://schemas.microsoft.com/office/drawing/2016/5/11/chartex" xmlns:cx6="http://schemas.microsoft.com/office/drawing/2016/5/12/chartex" xmlns:cx7="http://schemas.microsoft.com/office/drawing/2016/5/13/chartex" xmlns:cx8="http://schemas.microsoft.com/office/drawing/2016/5/14/chartex" xmlns:mc="http://schemas.openxmlformats.org/markup-compatibility/2006" xmlns:aink="http://schemas.microsoft.com/office/drawing/2016/ink" xmlns:am3d="http://schemas.microsoft.com/office/drawing/2017/model3d" xmlns:o="urn:schemas-microsoft-com:office:office" xmlns:oel="http://schemas.microsoft.com/office/2019/extlst" xmlns:r="http://schemas.openxmlformats.org/officeDocument/2006/relationships" xmlns:m="http://schemas.openxmlformats.org/officeDocument/2006/math" xmlns:v="urn:schemas-microsoft-com:vml" xmlns:wp14="http://schemas.microsoft.com/office/word/2010/wordprocessingDrawing" xmlns:wp="http://schemas.openxmlformats.org/drawingml/2006/wordprocessingDrawing" xmlns:w10="urn:schemas-microsoft-com:office:word" xmlns:w="http://schemas.openxmlformats.org/wordprocessingml/2006/main" xmlns:w14="http://schemas.microsoft.com/office/word/2010/wordml" xmlns:w15="http://schemas.microsoft.com/office/word/2012/wordml" xmlns:w16cex="http://schemas.microsoft.com/office/word/2018/wordml/cex" xmlns:w16cid="http://schemas.microsoft.com/office/word/2016/wordml/cid" xmlns:w16="http://schemas.microsoft.com/office/word/2018/wordml" xmlns:w16du="http://schemas.microsoft.com/office/word/2023/wordml/word16du" xmlns:w16sdtdh="http://schemas.microsoft.com/office/word/2020/wordml/sdtdatahash" xmlns:w16se="http://schemas.microsoft.com/office/word/2015/wordml/symex" xmlns:wpg="http://schemas.microsoft.com/office/word/2010/wordprocessingGroup" xmlns:wpi="http://schemas.microsoft.com/office/word/2010/wordprocessingInk" xmlns:wne="http://schemas.microsoft.com/office/word/2006/wordml" xmlns:wps="http://schemas.microsoft.com/office/word/2010/wordprocessingShape" mc:Ignorable="w14 w15 w16se w16cid w16 w16cex w16sdtdh wp14">
+<w:document xmlns:wpc="http://schemas.microsoft.com/office/word/2010/wordprocessingCanvas" xmlns:cx="http://schemas.microsoft.com/office/drawing/2014/chartex" xmlns:cx1="http://schemas.microsoft.com/office/drawing/2015/9/8/chartex" xmlns:cx2="http://schemas.microsoft.com/office/drawing/2015/10/21/chartex" xmlns:cx3="http://schemas.microsoft.com/office/drawing/2016/5/9/chartex" xmlns:cx4="http://schemas.microsoft.com/office/drawing/2016/5/10/chartex" xmlns:cx5="http://schemas.microsoft.com/office/drawing/2016/5/11/chartex" xmlns:cx6="http://schemas.microsoft.com/office/drawing/2016/5/12/chartex" xmlns:cx7="http://schemas.microsoft.com/office/drawing/2016/5/13/chartex" xmlns:cx8="http://schemas.microsoft.com/office/drawing/2016/5/14/chartex" xmlns:mc="http://schemas.openxmlformats.org/markup-compatibility/2006" xmlns:aink="http://schemas.microsoft.com/office/drawing/2016/ink" xmlns:am3d="http://schemas.microsoft.com/office/drawing/2017/model3d" xmlns:o="urn:schemas-microsoft-com:office:office" xmlns:r="http://schemas.openxmlformats.org/officeDocument/2006/relationships" xmlns:m="http://schemas.openxmlformats.org/officeDocument/2006/math" xmlns:v="urn:schemas-microsoft-com:vml" xmlns:wp14="http://schemas.microsoft.com/office/word/2010/wordprocessingDrawing" xmlns:wp="http://schemas.openxmlformats.org/drawingml/2006/wordprocessingDrawing" xmlns:w10="urn:schemas-microsoft-com:office:word" xmlns:w="http://schemas.openxmlformats.org/wordprocessingml/2006/main" xmlns:w14="http://schemas.microsoft.com/office/word/2010/wordml" xmlns:w15="http://schemas.microsoft.com/office/word/2012/wordml" xmlns:w16cex="http://schemas.microsoft.com/office/word/2018/wordml/cex" xmlns:w16cid="http://schemas.microsoft.com/office/word/2016/wordml/cid" xmlns:w16="http://schemas.microsoft.com/office/word/2018/wordml" xmlns:w16sdtdh="http://schemas.microsoft.com/office/word/2020/wordml/sdtdatahash" xmlns:w16se="http://schemas.microsoft.com/office/word/2015/wordml/symex" xmlns:wpg="http://schemas.microsoft.com/office/word/2010/wordprocessingGroup" xmlns:wpi="http://schemas.microsoft.com/office/word/2010/wordprocessingInk" xmlns:wne="http://schemas.microsoft.com/office/word/2006/wordml" xmlns:wps="http://schemas.microsoft.com/office/word/2010/wordprocessingShape" mc:Ignorable="w14 w15 w16se w16cid w16 w16cex w16sdtdh wp14">
   <w:body>
     <w:p>
       <w:pPr>
@@ -577,7 +577,6 @@
           </w:tcPr>
           <w:p>
             <w:pPr>
-              <w:spacing w:after="0" w:line="240" w:lineRule="auto"/>
               <w:rPr>
                 <w:rFonts w:eastAsia="Times New Roman" w:hAnsi="Georgia" w:cs="Times New Roman"/>
                 <w:sz w:val="24"/>
@@ -603,7 +602,6 @@
           </w:tcPr>
           <w:p>
             <w:pPr>
-              <w:spacing w:after="0" w:line="240" w:lineRule="auto"/>
               <w:rPr>
                 <w:rFonts w:eastAsia="Times New Roman" w:hAnsi="Georgia" w:cs="Times New Roman"/>
                 <w:sz w:val="24"/>
@@ -649,7 +647,6 @@
           </w:tcPr>
           <w:p>
             <w:pPr>
-              <w:spacing w:after="0" w:line="240" w:lineRule="auto"/>
               <w:rPr>
                 <w:rFonts w:eastAsia="Times New Roman" w:hAnsi="Georgia" w:cs="Times New Roman"/>
                 <w:sz w:val="24"/>
@@ -859,7 +856,6 @@
           </w:tcPr>
           <w:p>
             <w:pPr>
-              <w:spacing w:after="0" w:line="240" w:lineRule="auto"/>
               <w:rPr>
                 <w:rFonts w:eastAsia="Times New Roman" w:hAnsi="Georgia" w:cs="Times New Roman"/>
                 <w:sz w:val="24"/>
@@ -885,7 +881,6 @@
           </w:tcPr>
           <w:p>
             <w:pPr>
-              <w:spacing w:after="0" w:line="240" w:lineRule="auto"/>
               <w:rPr>
                 <w:rFonts w:eastAsia="Times New Roman" w:hAnsi="Georgia" w:cs="Times New Roman"/>
                 <w:sz w:val="24"/>
@@ -911,7 +906,6 @@
           </w:tcPr>
           <w:p>
             <w:pPr>
-              <w:spacing w:after="0" w:line="240" w:lineRule="auto"/>
               <w:rPr>
                 <w:rFonts w:eastAsia="Times New Roman" w:hAnsi="Georgia" w:cs="Times New Roman"/>
                 <w:sz w:val="24"/>
@@ -1059,7 +1053,6 @@
           </w:tcPr>
           <w:p>
             <w:pPr>
-              <w:spacing w:after="0" w:line="240" w:lineRule="auto"/>
               <w:rPr>
                 <w:rFonts w:eastAsia="Times New Roman" w:hAnsi="Georgia" w:cs="Times New Roman"/>
                 <w:sz w:val="24"/>
@@ -1087,7 +1080,6 @@
           </w:tcPr>
           <w:p>
             <w:pPr>
-              <w:spacing w:after="0" w:line="240" w:lineRule="auto"/>
               <w:rPr>
                 <w:rFonts w:eastAsia="Times New Roman" w:hAnsi="Georgia" w:cs="Times New Roman"/>
                 <w:sz w:val="24"/>
@@ -1113,7 +1105,6 @@
           </w:tcPr>
           <w:p>
             <w:pPr>
-              <w:spacing w:after="0" w:line="240" w:lineRule="auto"/>
               <w:rPr>
                 <w:rFonts w:eastAsia="Times New Roman" w:hAnsi="Georgia" w:cs="Times New Roman"/>
                 <w:sz w:val="24"/>
@@ -1141,7 +1132,6 @@
           </w:tcPr>
           <w:p>
             <w:pPr>
-              <w:spacing w:after="0" w:line="240" w:lineRule="auto"/>
               <w:rPr>
                 <w:rFonts w:eastAsia="Times New Roman" w:hAnsi="Georgia" w:cs="Times New Roman"/>
                 <w:sz w:val="24"/>
@@ -1167,7 +1157,6 @@
           </w:tcPr>
           <w:p>
             <w:pPr>
-              <w:spacing w:after="0" w:line="240" w:lineRule="auto"/>
               <w:rPr>
                 <w:rFonts w:eastAsia="Times New Roman" w:hAnsi="Georgia" w:cs="Times New Roman"/>
                 <w:sz w:val="24"/>
@@ -1195,7 +1184,6 @@
           </w:tcPr>
           <w:p>
             <w:pPr>
-              <w:spacing w:after="0" w:line="240" w:lineRule="auto"/>
               <w:rPr>
                 <w:rFonts w:eastAsia="Times New Roman" w:hAnsi="Georgia" w:cs="Times New Roman"/>
                 <w:sz w:val="24"/>
@@ -1221,7 +1209,6 @@
           </w:tcPr>
           <w:p>
             <w:pPr>
-              <w:spacing w:after="0" w:line="240" w:lineRule="auto"/>
               <w:rPr>
                 <w:rFonts w:eastAsia="Times New Roman" w:hAnsi="Georgia" w:cs="Times New Roman"/>
                 <w:sz w:val="24"/>
@@ -1285,7 +1272,6 @@
           </w:tcPr>
           <w:p>
             <w:pPr>
-              <w:spacing w:after="0" w:line="240" w:lineRule="auto"/>
               <w:rPr>
                 <w:rFonts w:eastAsia="Times New Roman" w:hAnsi="Georgia" w:cs="Times New Roman"/>
                 <w:sz w:val="24"/>
@@ -1311,7 +1297,6 @@
           </w:tcPr>
           <w:p>
             <w:pPr>
-              <w:spacing w:after="0" w:line="240" w:lineRule="auto"/>
               <w:rPr>
                 <w:rFonts w:eastAsia="Times New Roman" w:hAnsi="Georgia" w:cs="Times New Roman"/>
                 <w:sz w:val="24"/>
@@ -1339,7 +1324,6 @@
           </w:tcPr>
           <w:p>
             <w:pPr>
-              <w:spacing w:after="0" w:line="240" w:lineRule="auto"/>
               <w:rPr>
                 <w:rFonts w:eastAsia="Times New Roman" w:hAnsi="Georgia" w:cs="Times New Roman"/>
                 <w:sz w:val="24"/>
@@ -1365,7 +1349,6 @@
           </w:tcPr>
           <w:p>
             <w:pPr>
-              <w:spacing w:after="0" w:line="240" w:lineRule="auto"/>
               <w:rPr>
                 <w:rFonts w:eastAsia="Times New Roman" w:hAnsi="Georgia" w:cs="Times New Roman"/>
                 <w:sz w:val="24"/>
@@ -2033,23 +2016,7 @@
           <w:szCs w:val="24"/>
           <w:lang w:val="es-CO" w:eastAsia="es-CO"/>
         </w:rPr>
-        <w:t>, ejecutada</w:t>
-      </w:r>
-      <w:r>
-        <w:rPr>
-          <w:sz w:val="24"/>
-          <w:szCs w:val="24"/>
-          <w:lang w:val="es-CO" w:eastAsia="es-CO"/>
-        </w:rPr>
-        <w:t xml:space="preserve"> el 11/03/2026</w:t>
-      </w:r>
-      <w:r>
-        <w:rPr>
-          <w:sz w:val="24"/>
-          <w:szCs w:val="24"/>
-          <w:lang w:val="es-CO" w:eastAsia="es-CO"/>
-        </w:rPr>
-        <w:t>.</w:t>
+        <w:t>, ejecutada el 11/03/2026.</w:t>
       </w:r>
     </w:p>
     <w:p>
@@ -2268,7 +2235,6 @@
           </w:tcPr>
           <w:p>
             <w:pPr>
-              <w:spacing w:after="0" w:line="240" w:lineRule="auto"/>
               <w:rPr>
                 <w:rFonts w:eastAsia="Times New Roman" w:hAnsi="Georgia" w:cs="Times New Roman"/>
                 <w:sz w:val="24"/>
@@ -2294,7 +2260,6 @@
           </w:tcPr>
           <w:p>
             <w:pPr>
-              <w:spacing w:after="0" w:line="240" w:lineRule="auto"/>
               <w:rPr>
                 <w:rFonts w:eastAsia="Times New Roman" w:hAnsi="Georgia" w:cs="Times New Roman"/>
                 <w:sz w:val="24"/>
@@ -2561,10 +2526,10 @@
           <w:noProof/>
         </w:rPr>
         <w:drawing>
-          <wp:inline distT="0" distB="0" distL="0" distR="0" wp14:anchorId="2DA9A962" wp14:editId="342A5014">
-            <wp:extent cx="5058223" cy="3746810"/>
-            <wp:effectExtent l="0" t="0" r="9525" b="6350"/>
-            <wp:docPr id="1568309194" name="Imagen 2"/>
+          <wp:inline distT="0" distB="0" distL="0" distR="0" wp14:anchorId="6F4B4DAB" wp14:editId="0D42A546">
+            <wp:extent cx="6148241" cy="4305184"/>
+            <wp:effectExtent l="0" t="0" r="5080" b="635"/>
+            <wp:docPr id="2" name="Imagen 2"/>
             <wp:cNvGraphicFramePr>
               <a:graphicFrameLocks xmlns:a="http://schemas.openxmlformats.org/drawingml/2006/main" noChangeAspect="1"/>
             </wp:cNvGraphicFramePr>
@@ -2572,7 +2537,7 @@
               <a:graphicData uri="http://schemas.openxmlformats.org/drawingml/2006/picture">
                 <pic:pic xmlns:pic="http://schemas.openxmlformats.org/drawingml/2006/picture">
                   <pic:nvPicPr>
-                    <pic:cNvPr id="0" name="Picture 10"/>
+                    <pic:cNvPr id="0" name="Picture 1"/>
                     <pic:cNvPicPr>
                       <a:picLocks noChangeAspect="1" noChangeArrowheads="1"/>
                     </pic:cNvPicPr>
@@ -2593,7 +2558,7 @@
                   <pic:spPr bwMode="auto">
                     <a:xfrm>
                       <a:off x="0" y="0"/>
-                      <a:ext cx="5065458" cy="3752169"/>
+                      <a:ext cx="6160630" cy="4313859"/>
                     </a:xfrm>
                     <a:prstGeom prst="rect">
                       <a:avLst/>
@@ -2675,9 +2640,9 @@
         </w:rPr>
         <w:lastRenderedPageBreak/>
         <w:drawing>
-          <wp:inline distT="0" distB="0" distL="0" distR="0" wp14:anchorId="5F46E21B" wp14:editId="28C84489">
-            <wp:extent cx="5518150" cy="3319145"/>
-            <wp:effectExtent l="0" t="0" r="6350" b="0"/>
+          <wp:inline distT="0" distB="0" distL="0" distR="0" wp14:anchorId="5F46E21B" wp14:editId="1BD02A32">
+            <wp:extent cx="6246911" cy="3757492"/>
+            <wp:effectExtent l="0" t="0" r="1905" b="0"/>
             <wp:docPr id="582135914" name="Imagen 3"/>
             <wp:cNvGraphicFramePr>
               <a:graphicFrameLocks xmlns:a="http://schemas.openxmlformats.org/drawingml/2006/main" noChangeAspect="1"/>
@@ -2707,7 +2672,7 @@
                   <pic:spPr bwMode="auto">
                     <a:xfrm>
                       <a:off x="0" y="0"/>
-                      <a:ext cx="5518150" cy="3319145"/>
+                      <a:ext cx="6254112" cy="3761824"/>
                     </a:xfrm>
                     <a:prstGeom prst="rect">
                       <a:avLst/>
@@ -3176,7 +3141,6 @@
           <w:szCs w:val="24"/>
           <w:lang w:val="es-CO" w:eastAsia="es-CO"/>
         </w:rPr>
-        <w:lastRenderedPageBreak/>
         <w:t xml:space="preserve">Paso 1: Verificar datos iniciales en </w:t>
       </w:r>
       <w:proofErr w:type="spellStart"/>
@@ -3246,6 +3210,7 @@
       <w:r>
         <w:rPr>
           <w:rFonts w:eastAsia="Times New Roman" w:hAnsi="Georgia" w:cs="Times New Roman"/>
+          <w:noProof/>
           <w:sz w:val="24"/>
           <w:szCs w:val="24"/>
           <w:lang w:val="es-CO" w:eastAsia="es-CO"/>
@@ -3700,6 +3665,7 @@
       </w:pPr>
       <w:r>
         <w:rPr>
+          <w:noProof/>
           <w:lang w:val="es-CO" w:eastAsia="es-CO"/>
         </w:rPr>
         <w:drawing>
@@ -3819,6 +3785,7 @@
       </w:pPr>
       <w:r>
         <w:rPr>
+          <w:noProof/>
           <w:lang w:val="es-CO" w:eastAsia="es-CO"/>
         </w:rPr>
         <w:drawing>
@@ -4074,6 +4041,9 @@
         <w:pStyle w:val="Sinespaciado"/>
       </w:pPr>
       <w:r>
+        <w:rPr>
+          <w:noProof/>
+        </w:rPr>
         <w:drawing>
           <wp:inline distT="0" distB="0" distL="0" distR="0" wp14:anchorId="520F0525" wp14:editId="52A57C81">
             <wp:extent cx="6053489" cy="3585251"/>
@@ -4207,6 +4177,7 @@
       </w:pPr>
       <w:r>
         <w:rPr>
+          <w:noProof/>
           <w:lang w:val="es-CO" w:eastAsia="es-CO"/>
         </w:rPr>
         <w:drawing>
@@ -4388,6 +4359,7 @@
       </w:pPr>
       <w:r>
         <w:rPr>
+          <w:noProof/>
           <w:lang w:val="es-CO" w:eastAsia="es-CO"/>
         </w:rPr>
         <w:drawing>
@@ -4523,7 +4495,7 @@
               </wp:anchor>
             </w:drawing>
           </mc:Choice>
-          <mc:Fallback>
+          <mc:Fallback xmlns:w16du="http://schemas.microsoft.com/office/word/2023/wordml/word16du" xmlns:oel="http://schemas.microsoft.com/office/2019/extlst">
             <w:pict>
               <v:oval w14:anchorId="3F4CB724" id="Elipse 6" o:spid="_x0000_s1026" style="position:absolute;margin-left:8.55pt;margin-top:183.8pt;width:103.4pt;height:16.1pt;z-index:251660288;visibility:visible;mso-wrap-style:square;mso-wrap-distance-left:9pt;mso-wrap-distance-top:0;mso-wrap-distance-right:9pt;mso-wrap-distance-bottom:0;mso-position-horizontal:absolute;mso-position-horizontal-relative:text;mso-position-vertical:absolute;mso-position-vertical-relative:text;v-text-anchor:middle" o:gfxdata="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" filled="f" strokecolor="#1f3763 [1604]" strokeweight="1pt">
                 <v:stroke joinstyle="miter"/>
@@ -4534,6 +4506,7 @@
       </w:r>
       <w:r>
         <w:rPr>
+          <w:noProof/>
           <w:lang w:val="es-CO" w:eastAsia="es-CO"/>
         </w:rPr>
         <w:drawing>
@@ -4794,6 +4767,7 @@
       </w:pPr>
       <w:r>
         <w:rPr>
+          <w:noProof/>
           <w:lang w:val="es-CO" w:eastAsia="es-CO"/>
         </w:rPr>
         <w:drawing>
@@ -4846,15 +4820,7 @@
           <w:szCs w:val="20"/>
           <w:lang w:val="es-CO" w:eastAsia="es-CO"/>
         </w:rPr>
-        <w:t xml:space="preserve">Figura </w:t>
-      </w:r>
-      <w:r>
-        <w:rPr>
-          <w:sz w:val="20"/>
-          <w:szCs w:val="20"/>
-          <w:lang w:val="es-CO" w:eastAsia="es-CO"/>
-        </w:rPr>
-        <w:t>1</w:t>
+        <w:t>Figura 1</w:t>
       </w:r>
       <w:r>
         <w:rPr>
@@ -5130,7 +5096,6 @@
           </w:tcPr>
           <w:p>
             <w:pPr>
-              <w:spacing w:after="0" w:line="240" w:lineRule="auto"/>
               <w:rPr>
                 <w:rFonts w:eastAsia="Times New Roman" w:hAnsi="Georgia" w:cs="Times New Roman"/>
                 <w:sz w:val="24"/>
@@ -5156,7 +5121,6 @@
           </w:tcPr>
           <w:p>
             <w:pPr>
-              <w:spacing w:after="0" w:line="240" w:lineRule="auto"/>
               <w:rPr>
                 <w:rFonts w:eastAsia="Times New Roman" w:hAnsi="Georgia" w:cs="Times New Roman"/>
                 <w:sz w:val="24"/>
@@ -5182,7 +5146,6 @@
           </w:tcPr>
           <w:p>
             <w:pPr>
-              <w:spacing w:after="0" w:line="240" w:lineRule="auto"/>
               <w:rPr>
                 <w:rFonts w:eastAsia="Times New Roman" w:hAnsi="Georgia" w:cs="Times New Roman"/>
                 <w:sz w:val="24"/>
@@ -5341,7 +5304,6 @@
           </w:tcPr>
           <w:p>
             <w:pPr>
-              <w:spacing w:after="0" w:line="240" w:lineRule="auto"/>
               <w:rPr>
                 <w:rFonts w:eastAsia="Times New Roman" w:hAnsi="Georgia" w:cs="Times New Roman"/>
                 <w:sz w:val="24"/>
@@ -5367,7 +5329,6 @@
           </w:tcPr>
           <w:p>
             <w:pPr>
-              <w:spacing w:after="0" w:line="240" w:lineRule="auto"/>
               <w:rPr>
                 <w:rFonts w:eastAsia="Times New Roman" w:hAnsi="Georgia" w:cs="Times New Roman"/>
                 <w:sz w:val="24"/>
@@ -5395,7 +5356,6 @@
           </w:tcPr>
           <w:p>
             <w:pPr>
-              <w:spacing w:after="0" w:line="240" w:lineRule="auto"/>
               <w:rPr>
                 <w:rFonts w:eastAsia="Times New Roman" w:hAnsi="Georgia" w:cs="Times New Roman"/>
                 <w:sz w:val="24"/>
@@ -5421,7 +5381,6 @@
           </w:tcPr>
           <w:p>
             <w:pPr>
-              <w:spacing w:after="0" w:line="240" w:lineRule="auto"/>
               <w:rPr>
                 <w:rFonts w:eastAsia="Times New Roman" w:hAnsi="Georgia" w:cs="Times New Roman"/>
                 <w:sz w:val="24"/>
@@ -5600,7 +5559,6 @@
           </w:tcPr>
           <w:p>
             <w:pPr>
-              <w:spacing w:after="0" w:line="240" w:lineRule="auto"/>
               <w:rPr>
                 <w:rFonts w:eastAsia="Times New Roman" w:hAnsi="Georgia" w:cs="Times New Roman"/>
                 <w:sz w:val="24"/>
@@ -5626,7 +5584,6 @@
           </w:tcPr>
           <w:p>
             <w:pPr>
-              <w:spacing w:after="0" w:line="240" w:lineRule="auto"/>
               <w:rPr>
                 <w:rFonts w:eastAsia="Times New Roman" w:hAnsi="Georgia" w:cs="Times New Roman"/>
                 <w:sz w:val="24"/>
@@ -5652,7 +5609,6 @@
           </w:tcPr>
           <w:p>
             <w:pPr>
-              <w:spacing w:after="0" w:line="240" w:lineRule="auto"/>
               <w:rPr>
                 <w:rFonts w:eastAsia="Times New Roman" w:hAnsi="Georgia" w:cs="Times New Roman"/>
                 <w:sz w:val="24"/>
@@ -5678,7 +5634,6 @@
           </w:tcPr>
           <w:p>
             <w:pPr>
-              <w:spacing w:after="0" w:line="240" w:lineRule="auto"/>
               <w:rPr>
                 <w:rFonts w:eastAsia="Times New Roman" w:hAnsi="Georgia" w:cs="Times New Roman"/>
                 <w:sz w:val="24"/>
@@ -5837,7 +5792,6 @@
           </w:tcPr>
           <w:p>
             <w:pPr>
-              <w:spacing w:after="0" w:line="240" w:lineRule="auto"/>
               <w:rPr>
                 <w:rFonts w:eastAsia="Times New Roman" w:hAnsi="Georgia" w:cs="Times New Roman"/>
                 <w:sz w:val="24"/>
@@ -5863,7 +5817,6 @@
           </w:tcPr>
           <w:p>
             <w:pPr>
-              <w:spacing w:after="0" w:line="240" w:lineRule="auto"/>
               <w:rPr>
                 <w:rFonts w:eastAsia="Times New Roman" w:hAnsi="Georgia" w:cs="Times New Roman"/>
                 <w:sz w:val="24"/>
@@ -5889,7 +5842,6 @@
           </w:tcPr>
           <w:p>
             <w:pPr>
-              <w:spacing w:after="0" w:line="240" w:lineRule="auto"/>
               <w:rPr>
                 <w:rFonts w:eastAsia="Times New Roman" w:hAnsi="Georgia" w:cs="Times New Roman"/>
                 <w:sz w:val="24"/>
@@ -5915,7 +5867,6 @@
           </w:tcPr>
           <w:p>
             <w:pPr>
-              <w:spacing w:after="0" w:line="240" w:lineRule="auto"/>
               <w:rPr>
                 <w:rFonts w:eastAsia="Times New Roman" w:hAnsi="Georgia" w:cs="Times New Roman"/>
                 <w:sz w:val="24"/>
@@ -5994,7 +5945,6 @@
           </w:tcPr>
           <w:p>
             <w:pPr>
-              <w:spacing w:after="0" w:line="240" w:lineRule="auto"/>
               <w:rPr>
                 <w:rFonts w:eastAsia="Times New Roman" w:hAnsi="Georgia" w:cs="Times New Roman"/>
                 <w:sz w:val="24"/>
@@ -6020,7 +5970,6 @@
           </w:tcPr>
           <w:p>
             <w:pPr>
-              <w:spacing w:after="0" w:line="240" w:lineRule="auto"/>
               <w:rPr>
                 <w:rFonts w:eastAsia="Times New Roman" w:hAnsi="Georgia" w:cs="Times New Roman"/>
                 <w:sz w:val="24"/>
@@ -6048,7 +5997,6 @@
           </w:tcPr>
           <w:p>
             <w:pPr>
-              <w:spacing w:after="0" w:line="240" w:lineRule="auto"/>
               <w:rPr>
                 <w:rFonts w:eastAsia="Times New Roman" w:hAnsi="Georgia" w:cs="Times New Roman"/>
                 <w:sz w:val="24"/>
@@ -6074,7 +6022,6 @@
           </w:tcPr>
           <w:p>
             <w:pPr>
-              <w:spacing w:after="0" w:line="240" w:lineRule="auto"/>
               <w:rPr>
                 <w:rFonts w:eastAsia="Times New Roman" w:hAnsi="Georgia" w:cs="Times New Roman"/>
                 <w:sz w:val="24"/>
@@ -6213,7 +6160,6 @@
           </w:tcPr>
           <w:p>
             <w:pPr>
-              <w:spacing w:after="0" w:line="240" w:lineRule="auto"/>
               <w:rPr>
                 <w:rFonts w:eastAsia="Times New Roman" w:hAnsi="Georgia" w:cs="Times New Roman"/>
                 <w:sz w:val="24"/>
@@ -6239,7 +6185,6 @@
           </w:tcPr>
           <w:p>
             <w:pPr>
-              <w:spacing w:after="0" w:line="240" w:lineRule="auto"/>
               <w:rPr>
                 <w:rFonts w:eastAsia="Times New Roman" w:hAnsi="Georgia" w:cs="Times New Roman"/>
                 <w:sz w:val="24"/>
@@ -6265,7 +6210,6 @@
           </w:tcPr>
           <w:p>
             <w:pPr>
-              <w:spacing w:after="0" w:line="240" w:lineRule="auto"/>
               <w:rPr>
                 <w:rFonts w:eastAsia="Times New Roman" w:hAnsi="Georgia" w:cs="Times New Roman"/>
                 <w:sz w:val="24"/>
@@ -6291,7 +6235,6 @@
           </w:tcPr>
           <w:p>
             <w:pPr>
-              <w:spacing w:after="0" w:line="240" w:lineRule="auto"/>
               <w:rPr>
                 <w:rFonts w:eastAsia="Times New Roman" w:hAnsi="Georgia" w:cs="Times New Roman"/>
                 <w:sz w:val="24"/>
@@ -6480,22 +6423,20 @@
           </w:tcPr>
           <w:p>
             <w:pPr>
-              <w:spacing w:after="0" w:line="240" w:lineRule="auto"/>
-              <w:rPr>
-                <w:rFonts w:eastAsia="Times New Roman" w:hAnsi="Georgia" w:cs="Times New Roman"/>
-                <w:sz w:val="24"/>
-                <w:szCs w:val="24"/>
-                <w:lang w:val="es-CO" w:eastAsia="es-CO"/>
-              </w:rPr>
-            </w:pPr>
-            <w:r>
-              <w:rPr>
-                <w:rFonts w:eastAsia="Times New Roman" w:hAnsi="Georgia" w:cs="Times New Roman"/>
-                <w:sz w:val="24"/>
-                <w:szCs w:val="24"/>
-                <w:lang w:val="es-CO" w:eastAsia="es-CO"/>
-              </w:rPr>
-              <w:lastRenderedPageBreak/>
+              <w:rPr>
+                <w:rFonts w:eastAsia="Times New Roman" w:hAnsi="Georgia" w:cs="Times New Roman"/>
+                <w:sz w:val="24"/>
+                <w:szCs w:val="24"/>
+                <w:lang w:val="es-CO" w:eastAsia="es-CO"/>
+              </w:rPr>
+            </w:pPr>
+            <w:r>
+              <w:rPr>
+                <w:rFonts w:eastAsia="Times New Roman" w:hAnsi="Georgia" w:cs="Times New Roman"/>
+                <w:sz w:val="24"/>
+                <w:szCs w:val="24"/>
+                <w:lang w:val="es-CO" w:eastAsia="es-CO"/>
+              </w:rPr>
               <w:t>7</w:t>
             </w:r>
           </w:p>
@@ -6507,7 +6448,6 @@
           </w:tcPr>
           <w:p>
             <w:pPr>
-              <w:spacing w:after="0" w:line="240" w:lineRule="auto"/>
               <w:rPr>
                 <w:rFonts w:eastAsia="Times New Roman" w:hAnsi="Georgia" w:cs="Times New Roman"/>
                 <w:sz w:val="24"/>
@@ -6533,7 +6473,6 @@
           </w:tcPr>
           <w:p>
             <w:pPr>
-              <w:spacing w:after="0" w:line="240" w:lineRule="auto"/>
               <w:rPr>
                 <w:rFonts w:eastAsia="Times New Roman" w:hAnsi="Georgia" w:cs="Times New Roman"/>
                 <w:sz w:val="24"/>
@@ -6559,7 +6498,6 @@
           </w:tcPr>
           <w:p>
             <w:pPr>
-              <w:spacing w:after="0" w:line="240" w:lineRule="auto"/>
               <w:rPr>
                 <w:rFonts w:eastAsia="Times New Roman" w:hAnsi="Georgia" w:cs="Times New Roman"/>
                 <w:sz w:val="24"/>
@@ -6678,7 +6616,6 @@
           </w:tcPr>
           <w:p>
             <w:pPr>
-              <w:spacing w:after="0" w:line="240" w:lineRule="auto"/>
               <w:rPr>
                 <w:rFonts w:eastAsia="Times New Roman" w:hAnsi="Georgia" w:cs="Times New Roman"/>
                 <w:sz w:val="24"/>
@@ -6704,7 +6641,6 @@
           </w:tcPr>
           <w:p>
             <w:pPr>
-              <w:spacing w:after="0" w:line="240" w:lineRule="auto"/>
               <w:rPr>
                 <w:rFonts w:eastAsia="Times New Roman" w:hAnsi="Georgia" w:cs="Times New Roman"/>
                 <w:sz w:val="24"/>
@@ -6730,7 +6666,6 @@
           </w:tcPr>
           <w:p>
             <w:pPr>
-              <w:spacing w:after="0" w:line="240" w:lineRule="auto"/>
               <w:rPr>
                 <w:rFonts w:eastAsia="Times New Roman" w:hAnsi="Georgia" w:cs="Times New Roman"/>
                 <w:sz w:val="24"/>
@@ -6756,7 +6691,6 @@
           </w:tcPr>
           <w:p>
             <w:pPr>
-              <w:spacing w:after="0" w:line="240" w:lineRule="auto"/>
               <w:rPr>
                 <w:rFonts w:eastAsia="Times New Roman" w:hAnsi="Georgia" w:cs="Times New Roman"/>
                 <w:sz w:val="24"/>
@@ -6835,7 +6769,6 @@
           </w:tcPr>
           <w:p>
             <w:pPr>
-              <w:spacing w:after="0" w:line="240" w:lineRule="auto"/>
               <w:rPr>
                 <w:rFonts w:eastAsia="Times New Roman" w:hAnsi="Georgia" w:cs="Times New Roman"/>
                 <w:sz w:val="24"/>
@@ -6861,7 +6794,6 @@
           </w:tcPr>
           <w:p>
             <w:pPr>
-              <w:spacing w:after="0" w:line="240" w:lineRule="auto"/>
               <w:rPr>
                 <w:rFonts w:eastAsia="Times New Roman" w:hAnsi="Georgia" w:cs="Times New Roman"/>
                 <w:sz w:val="24"/>
@@ -6887,7 +6819,6 @@
           </w:tcPr>
           <w:p>
             <w:pPr>
-              <w:spacing w:after="0" w:line="240" w:lineRule="auto"/>
               <w:rPr>
                 <w:rFonts w:eastAsia="Times New Roman" w:hAnsi="Georgia" w:cs="Times New Roman"/>
                 <w:sz w:val="24"/>
@@ -6913,7 +6844,6 @@
           </w:tcPr>
           <w:p>
             <w:pPr>
-              <w:spacing w:after="0" w:line="240" w:lineRule="auto"/>
               <w:rPr>
                 <w:rFonts w:eastAsia="Times New Roman" w:hAnsi="Georgia" w:cs="Times New Roman"/>
                 <w:sz w:val="24"/>
@@ -7052,7 +6982,6 @@
           </w:tcPr>
           <w:p>
             <w:pPr>
-              <w:spacing w:after="0" w:line="240" w:lineRule="auto"/>
               <w:rPr>
                 <w:rFonts w:eastAsia="Times New Roman" w:hAnsi="Georgia" w:cs="Times New Roman"/>
                 <w:sz w:val="24"/>
@@ -7078,7 +7007,6 @@
           </w:tcPr>
           <w:p>
             <w:pPr>
-              <w:spacing w:after="0" w:line="240" w:lineRule="auto"/>
               <w:rPr>
                 <w:rFonts w:eastAsia="Times New Roman" w:hAnsi="Georgia" w:cs="Times New Roman"/>
                 <w:sz w:val="24"/>
@@ -7106,7 +7034,6 @@
           </w:tcPr>
           <w:p>
             <w:pPr>
-              <w:spacing w:after="0" w:line="240" w:lineRule="auto"/>
               <w:rPr>
                 <w:rFonts w:eastAsia="Times New Roman" w:hAnsi="Georgia" w:cs="Times New Roman"/>
                 <w:sz w:val="24"/>
@@ -7132,7 +7059,6 @@
           </w:tcPr>
           <w:p>
             <w:pPr>
-              <w:spacing w:after="0" w:line="240" w:lineRule="auto"/>
               <w:rPr>
                 <w:rFonts w:eastAsia="Times New Roman" w:hAnsi="Georgia" w:cs="Times New Roman"/>
                 <w:sz w:val="24"/>
@@ -7331,7 +7257,6 @@
           </w:tcPr>
           <w:p>
             <w:pPr>
-              <w:spacing w:after="0" w:line="240" w:lineRule="auto"/>
               <w:rPr>
                 <w:rFonts w:eastAsia="Times New Roman" w:hAnsi="Georgia" w:cs="Times New Roman"/>
                 <w:sz w:val="24"/>
@@ -7357,7 +7282,6 @@
           </w:tcPr>
           <w:p>
             <w:pPr>
-              <w:spacing w:after="0" w:line="240" w:lineRule="auto"/>
               <w:rPr>
                 <w:rFonts w:eastAsia="Times New Roman" w:hAnsi="Georgia" w:cs="Times New Roman"/>
                 <w:sz w:val="24"/>
@@ -7385,7 +7309,6 @@
           </w:tcPr>
           <w:p>
             <w:pPr>
-              <w:spacing w:after="0" w:line="240" w:lineRule="auto"/>
               <w:rPr>
                 <w:rFonts w:eastAsia="Times New Roman" w:hAnsi="Georgia" w:cs="Times New Roman"/>
                 <w:sz w:val="24"/>
@@ -7411,7 +7334,6 @@
           </w:tcPr>
           <w:p>
             <w:pPr>
-              <w:spacing w:after="0" w:line="240" w:lineRule="auto"/>
               <w:rPr>
                 <w:rFonts w:eastAsia="Times New Roman" w:hAnsi="Georgia" w:cs="Times New Roman"/>
                 <w:sz w:val="24"/>
@@ -7590,7 +7512,6 @@
           </w:tcPr>
           <w:p>
             <w:pPr>
-              <w:spacing w:after="0" w:line="240" w:lineRule="auto"/>
               <w:rPr>
                 <w:rFonts w:eastAsia="Times New Roman" w:hAnsi="Georgia" w:cs="Times New Roman"/>
                 <w:sz w:val="24"/>
@@ -7616,7 +7537,6 @@
           </w:tcPr>
           <w:p>
             <w:pPr>
-              <w:spacing w:after="0" w:line="240" w:lineRule="auto"/>
               <w:rPr>
                 <w:rFonts w:eastAsia="Times New Roman" w:hAnsi="Georgia" w:cs="Times New Roman"/>
                 <w:sz w:val="24"/>
@@ -7642,7 +7562,6 @@
           </w:tcPr>
           <w:p>
             <w:pPr>
-              <w:spacing w:after="0" w:line="240" w:lineRule="auto"/>
               <w:rPr>
                 <w:rFonts w:eastAsia="Times New Roman" w:hAnsi="Georgia" w:cs="Times New Roman"/>
                 <w:sz w:val="24"/>
@@ -7668,7 +7587,6 @@
           </w:tcPr>
           <w:p>
             <w:pPr>
-              <w:spacing w:after="0" w:line="240" w:lineRule="auto"/>
               <w:rPr>
                 <w:rFonts w:eastAsia="Times New Roman" w:hAnsi="Georgia" w:cs="Times New Roman"/>
                 <w:sz w:val="24"/>
@@ -7747,7 +7665,6 @@
           </w:tcPr>
           <w:p>
             <w:pPr>
-              <w:spacing w:after="0" w:line="240" w:lineRule="auto"/>
               <w:rPr>
                 <w:rFonts w:eastAsia="Times New Roman" w:hAnsi="Georgia" w:cs="Times New Roman"/>
                 <w:sz w:val="24"/>
@@ -7773,7 +7690,6 @@
           </w:tcPr>
           <w:p>
             <w:pPr>
-              <w:spacing w:after="0" w:line="240" w:lineRule="auto"/>
               <w:rPr>
                 <w:rFonts w:eastAsia="Times New Roman" w:hAnsi="Georgia" w:cs="Times New Roman"/>
                 <w:sz w:val="24"/>
@@ -7801,7 +7717,6 @@
           </w:tcPr>
           <w:p>
             <w:pPr>
-              <w:spacing w:after="0" w:line="240" w:lineRule="auto"/>
               <w:rPr>
                 <w:rFonts w:eastAsia="Times New Roman" w:hAnsi="Georgia" w:cs="Times New Roman"/>
                 <w:sz w:val="24"/>
@@ -7827,7 +7742,6 @@
           </w:tcPr>
           <w:p>
             <w:pPr>
-              <w:spacing w:after="0" w:line="240" w:lineRule="auto"/>
               <w:rPr>
                 <w:rFonts w:eastAsia="Times New Roman" w:hAnsi="Georgia" w:cs="Times New Roman"/>
                 <w:sz w:val="24"/>
@@ -7886,7 +7800,6 @@
           </w:tcPr>
           <w:p>
             <w:pPr>
-              <w:spacing w:after="0" w:line="240" w:lineRule="auto"/>
               <w:rPr>
                 <w:rFonts w:eastAsia="Times New Roman" w:hAnsi="Georgia" w:cs="Times New Roman"/>
                 <w:sz w:val="24"/>
@@ -7912,7 +7825,6 @@
           </w:tcPr>
           <w:p>
             <w:pPr>
-              <w:spacing w:after="0" w:line="240" w:lineRule="auto"/>
               <w:rPr>
                 <w:rFonts w:eastAsia="Times New Roman" w:hAnsi="Georgia" w:cs="Times New Roman"/>
                 <w:sz w:val="24"/>
@@ -7938,7 +7850,6 @@
           </w:tcPr>
           <w:p>
             <w:pPr>
-              <w:spacing w:after="0" w:line="240" w:lineRule="auto"/>
               <w:rPr>
                 <w:rFonts w:eastAsia="Times New Roman" w:hAnsi="Georgia" w:cs="Times New Roman"/>
                 <w:sz w:val="24"/>
@@ -7964,7 +7875,6 @@
           </w:tcPr>
           <w:p>
             <w:pPr>
-              <w:spacing w:after="0" w:line="240" w:lineRule="auto"/>
               <w:rPr>
                 <w:rFonts w:eastAsia="Times New Roman" w:hAnsi="Georgia" w:cs="Times New Roman"/>
                 <w:sz w:val="24"/>
@@ -8063,7 +7973,6 @@
           </w:tcPr>
           <w:p>
             <w:pPr>
-              <w:spacing w:after="0" w:line="240" w:lineRule="auto"/>
               <w:rPr>
                 <w:rFonts w:eastAsia="Times New Roman" w:hAnsi="Georgia" w:cs="Times New Roman"/>
                 <w:sz w:val="24"/>
@@ -8089,7 +7998,6 @@
           </w:tcPr>
           <w:p>
             <w:pPr>
-              <w:spacing w:after="0" w:line="240" w:lineRule="auto"/>
               <w:rPr>
                 <w:rFonts w:eastAsia="Times New Roman" w:hAnsi="Georgia" w:cs="Times New Roman"/>
                 <w:sz w:val="24"/>
@@ -8117,7 +8025,6 @@
           </w:tcPr>
           <w:p>
             <w:pPr>
-              <w:spacing w:after="0" w:line="240" w:lineRule="auto"/>
               <w:rPr>
                 <w:rFonts w:eastAsia="Times New Roman" w:hAnsi="Georgia" w:cs="Times New Roman"/>
                 <w:sz w:val="24"/>
@@ -8143,7 +8050,6 @@
           </w:tcPr>
           <w:p>
             <w:pPr>
-              <w:spacing w:after="0" w:line="240" w:lineRule="auto"/>
               <w:rPr>
                 <w:rFonts w:eastAsia="Times New Roman" w:hAnsi="Georgia" w:cs="Times New Roman"/>
                 <w:sz w:val="24"/>
@@ -8222,7 +8128,6 @@
           </w:tcPr>
           <w:p>
             <w:pPr>
-              <w:spacing w:after="0" w:line="240" w:lineRule="auto"/>
               <w:rPr>
                 <w:rFonts w:eastAsia="Times New Roman" w:hAnsi="Georgia" w:cs="Times New Roman"/>
                 <w:sz w:val="24"/>
@@ -8248,7 +8153,6 @@
           </w:tcPr>
           <w:p>
             <w:pPr>
-              <w:spacing w:after="0" w:line="240" w:lineRule="auto"/>
               <w:rPr>
                 <w:rFonts w:eastAsia="Times New Roman" w:hAnsi="Georgia" w:cs="Times New Roman"/>
                 <w:sz w:val="24"/>
@@ -8276,7 +8180,6 @@
           </w:tcPr>
           <w:p>
             <w:pPr>
-              <w:spacing w:after="0" w:line="240" w:lineRule="auto"/>
               <w:rPr>
                 <w:rFonts w:eastAsia="Times New Roman" w:hAnsi="Georgia" w:cs="Times New Roman"/>
                 <w:sz w:val="24"/>
@@ -8302,7 +8205,6 @@
           </w:tcPr>
           <w:p>
             <w:pPr>
-              <w:spacing w:after="0" w:line="240" w:lineRule="auto"/>
               <w:rPr>
                 <w:rFonts w:eastAsia="Times New Roman" w:hAnsi="Georgia" w:cs="Times New Roman"/>
                 <w:sz w:val="24"/>
@@ -8381,7 +8283,6 @@
           </w:tcPr>
           <w:p>
             <w:pPr>
-              <w:spacing w:after="0" w:line="240" w:lineRule="auto"/>
               <w:rPr>
                 <w:rFonts w:eastAsia="Times New Roman" w:hAnsi="Georgia" w:cs="Times New Roman"/>
                 <w:sz w:val="24"/>
@@ -8407,7 +8308,6 @@
           </w:tcPr>
           <w:p>
             <w:pPr>
-              <w:spacing w:after="0" w:line="240" w:lineRule="auto"/>
               <w:rPr>
                 <w:rFonts w:eastAsia="Times New Roman" w:hAnsi="Georgia" w:cs="Times New Roman"/>
                 <w:sz w:val="24"/>
@@ -8433,7 +8333,6 @@
           </w:tcPr>
           <w:p>
             <w:pPr>
-              <w:spacing w:after="0" w:line="240" w:lineRule="auto"/>
               <w:rPr>
                 <w:rFonts w:eastAsia="Times New Roman" w:hAnsi="Georgia" w:cs="Times New Roman"/>
                 <w:sz w:val="24"/>
@@ -8459,7 +8358,6 @@
           </w:tcPr>
           <w:p>
             <w:pPr>
-              <w:spacing w:after="0" w:line="240" w:lineRule="auto"/>
               <w:rPr>
                 <w:rFonts w:eastAsia="Times New Roman" w:hAnsi="Georgia" w:cs="Times New Roman"/>
                 <w:sz w:val="24"/>
@@ -8538,7 +8436,6 @@
           </w:tcPr>
           <w:p>
             <w:pPr>
-              <w:spacing w:after="0" w:line="240" w:lineRule="auto"/>
               <w:rPr>
                 <w:rFonts w:eastAsia="Times New Roman" w:hAnsi="Georgia" w:cs="Times New Roman"/>
                 <w:sz w:val="24"/>
@@ -8564,7 +8461,6 @@
           </w:tcPr>
           <w:p>
             <w:pPr>
-              <w:spacing w:after="0" w:line="240" w:lineRule="auto"/>
               <w:rPr>
                 <w:rFonts w:eastAsia="Times New Roman" w:hAnsi="Georgia" w:cs="Times New Roman"/>
                 <w:sz w:val="24"/>
@@ -8590,7 +8486,6 @@
           </w:tcPr>
           <w:p>
             <w:pPr>
-              <w:spacing w:after="0" w:line="240" w:lineRule="auto"/>
               <w:rPr>
                 <w:rFonts w:eastAsia="Times New Roman" w:hAnsi="Georgia" w:cs="Times New Roman"/>
                 <w:sz w:val="24"/>
@@ -8616,7 +8511,6 @@
           </w:tcPr>
           <w:p>
             <w:pPr>
-              <w:spacing w:after="0" w:line="240" w:lineRule="auto"/>
               <w:rPr>
                 <w:rFonts w:eastAsia="Times New Roman" w:hAnsi="Georgia" w:cs="Times New Roman"/>
                 <w:sz w:val="24"/>
@@ -8735,7 +8629,6 @@
           </w:tcPr>
           <w:p>
             <w:pPr>
-              <w:spacing w:after="0" w:line="240" w:lineRule="auto"/>
               <w:rPr>
                 <w:rFonts w:eastAsia="Times New Roman" w:hAnsi="Georgia" w:cs="Times New Roman"/>
                 <w:sz w:val="24"/>
@@ -8761,7 +8654,6 @@
           </w:tcPr>
           <w:p>
             <w:pPr>
-              <w:spacing w:after="0" w:line="240" w:lineRule="auto"/>
               <w:rPr>
                 <w:rFonts w:eastAsia="Times New Roman" w:hAnsi="Georgia" w:cs="Times New Roman"/>
                 <w:sz w:val="24"/>
@@ -8789,7 +8681,6 @@
           </w:tcPr>
           <w:p>
             <w:pPr>
-              <w:spacing w:after="0" w:line="240" w:lineRule="auto"/>
               <w:rPr>
                 <w:rFonts w:eastAsia="Times New Roman" w:hAnsi="Georgia" w:cs="Times New Roman"/>
                 <w:sz w:val="24"/>
@@ -8815,7 +8706,6 @@
           </w:tcPr>
           <w:p>
             <w:pPr>
-              <w:spacing w:after="0" w:line="240" w:lineRule="auto"/>
               <w:rPr>
                 <w:rFonts w:eastAsia="Times New Roman" w:hAnsi="Georgia" w:cs="Times New Roman"/>
                 <w:sz w:val="24"/>
@@ -8903,7 +8793,6 @@
           </w:tcPr>
           <w:p>
             <w:pPr>
-              <w:spacing w:after="0" w:line="240" w:lineRule="auto"/>
               <w:rPr>
                 <w:rFonts w:eastAsia="Times New Roman" w:hAnsi="Georgia" w:cs="Times New Roman"/>
                 <w:sz w:val="24"/>
@@ -8929,7 +8818,6 @@
           </w:tcPr>
           <w:p>
             <w:pPr>
-              <w:spacing w:after="0" w:line="240" w:lineRule="auto"/>
               <w:rPr>
                 <w:rFonts w:eastAsia="Times New Roman" w:hAnsi="Georgia" w:cs="Times New Roman"/>
                 <w:sz w:val="24"/>
@@ -8955,7 +8843,6 @@
           </w:tcPr>
           <w:p>
             <w:pPr>
-              <w:spacing w:after="0" w:line="240" w:lineRule="auto"/>
               <w:rPr>
                 <w:rFonts w:eastAsia="Times New Roman" w:hAnsi="Georgia" w:cs="Times New Roman"/>
                 <w:sz w:val="24"/>
@@ -8981,7 +8868,6 @@
           </w:tcPr>
           <w:p>
             <w:pPr>
-              <w:spacing w:after="0" w:line="240" w:lineRule="auto"/>
               <w:rPr>
                 <w:rFonts w:eastAsia="Times New Roman" w:hAnsi="Georgia" w:cs="Times New Roman"/>
                 <w:sz w:val="24"/>
@@ -9080,7 +8966,6 @@
           </w:tcPr>
           <w:p>
             <w:pPr>
-              <w:spacing w:after="0" w:line="240" w:lineRule="auto"/>
               <w:rPr>
                 <w:rFonts w:eastAsia="Times New Roman" w:hAnsi="Georgia" w:cs="Times New Roman"/>
                 <w:sz w:val="24"/>
@@ -9106,7 +8991,6 @@
           </w:tcPr>
           <w:p>
             <w:pPr>
-              <w:spacing w:after="0" w:line="240" w:lineRule="auto"/>
               <w:rPr>
                 <w:rFonts w:eastAsia="Times New Roman" w:hAnsi="Georgia" w:cs="Times New Roman"/>
                 <w:sz w:val="24"/>
@@ -9132,7 +9016,6 @@
           </w:tcPr>
           <w:p>
             <w:pPr>
-              <w:spacing w:after="0" w:line="240" w:lineRule="auto"/>
               <w:rPr>
                 <w:rFonts w:eastAsia="Times New Roman" w:hAnsi="Georgia" w:cs="Times New Roman"/>
                 <w:sz w:val="24"/>
@@ -9158,7 +9041,6 @@
           </w:tcPr>
           <w:p>
             <w:pPr>
-              <w:spacing w:after="0" w:line="240" w:lineRule="auto"/>
               <w:rPr>
                 <w:rFonts w:eastAsia="Times New Roman" w:hAnsi="Georgia" w:cs="Times New Roman"/>
                 <w:sz w:val="24"/>
@@ -9589,7 +9471,6 @@
           </w:tcPr>
           <w:p>
             <w:pPr>
-              <w:spacing w:after="0" w:line="240" w:lineRule="auto"/>
               <w:rPr>
                 <w:rFonts w:eastAsia="Times New Roman" w:hAnsi="Georgia" w:cs="Times New Roman"/>
                 <w:sz w:val="24"/>
@@ -9637,7 +9518,6 @@
           </w:tcPr>
           <w:p>
             <w:pPr>
-              <w:spacing w:after="0" w:line="240" w:lineRule="auto"/>
               <w:rPr>
                 <w:rFonts w:eastAsia="Times New Roman" w:hAnsi="Georgia" w:cs="Times New Roman"/>
                 <w:sz w:val="24"/>
@@ -9663,7 +9543,6 @@
           </w:tcPr>
           <w:p>
             <w:pPr>
-              <w:spacing w:after="0" w:line="240" w:lineRule="auto"/>
               <w:rPr>
                 <w:rFonts w:eastAsia="Times New Roman" w:hAnsi="Georgia" w:cs="Times New Roman"/>
                 <w:sz w:val="24"/>
@@ -9691,7 +9570,6 @@
           </w:tcPr>
           <w:p>
             <w:pPr>
-              <w:spacing w:after="0" w:line="240" w:lineRule="auto"/>
               <w:rPr>
                 <w:rFonts w:eastAsia="Times New Roman" w:hAnsi="Georgia" w:cs="Times New Roman"/>
                 <w:sz w:val="24"/>
@@ -9717,7 +9595,6 @@
           </w:tcPr>
           <w:p>
             <w:pPr>
-              <w:spacing w:after="0" w:line="240" w:lineRule="auto"/>
               <w:rPr>
                 <w:rFonts w:eastAsia="Times New Roman" w:hAnsi="Georgia" w:cs="Times New Roman"/>
                 <w:sz w:val="24"/>
@@ -9754,7 +9631,6 @@
           </w:tcPr>
           <w:p>
             <w:pPr>
-              <w:spacing w:after="0" w:line="240" w:lineRule="auto"/>
               <w:rPr>
                 <w:rFonts w:eastAsia="Times New Roman" w:hAnsi="Georgia" w:cs="Times New Roman"/>
                 <w:sz w:val="24"/>
@@ -9802,7 +9678,6 @@
           </w:tcPr>
           <w:p>
             <w:pPr>
-              <w:spacing w:after="0" w:line="240" w:lineRule="auto"/>
               <w:rPr>
                 <w:rFonts w:eastAsia="Times New Roman" w:hAnsi="Georgia" w:cs="Times New Roman"/>
                 <w:sz w:val="24"/>
@@ -9830,7 +9705,6 @@
           </w:tcPr>
           <w:p>
             <w:pPr>
-              <w:spacing w:after="0" w:line="240" w:lineRule="auto"/>
               <w:rPr>
                 <w:rFonts w:eastAsia="Times New Roman" w:hAnsi="Georgia" w:cs="Times New Roman"/>
                 <w:sz w:val="24"/>
@@ -9856,7 +9730,6 @@
           </w:tcPr>
           <w:p>
             <w:pPr>
-              <w:spacing w:after="0" w:line="240" w:lineRule="auto"/>
               <w:rPr>
                 <w:rFonts w:eastAsia="Times New Roman" w:hAnsi="Georgia" w:cs="Times New Roman"/>
                 <w:sz w:val="24"/>
@@ -9933,7 +9806,6 @@
           </w:tcPr>
           <w:p>
             <w:pPr>
-              <w:spacing w:after="0" w:line="240" w:lineRule="auto"/>
               <w:rPr>
                 <w:rFonts w:eastAsia="Times New Roman" w:hAnsi="Georgia" w:cs="Times New Roman"/>
                 <w:sz w:val="24"/>
@@ -9961,7 +9833,6 @@
           </w:tcPr>
           <w:p>
             <w:pPr>
-              <w:spacing w:after="0" w:line="240" w:lineRule="auto"/>
               <w:rPr>
                 <w:rFonts w:eastAsia="Times New Roman" w:hAnsi="Georgia" w:cs="Times New Roman"/>
                 <w:sz w:val="24"/>
@@ -9989,7 +9860,6 @@
           </w:tcPr>
           <w:p>
             <w:pPr>
-              <w:spacing w:after="0" w:line="240" w:lineRule="auto"/>
               <w:rPr>
                 <w:rFonts w:eastAsia="Times New Roman" w:hAnsi="Georgia" w:cs="Times New Roman"/>
                 <w:sz w:val="24"/>
@@ -10015,7 +9885,6 @@
           </w:tcPr>
           <w:p>
             <w:pPr>
-              <w:spacing w:after="0" w:line="240" w:lineRule="auto"/>
               <w:rPr>
                 <w:rFonts w:eastAsia="Times New Roman" w:hAnsi="Georgia" w:cs="Times New Roman"/>
                 <w:sz w:val="24"/>
@@ -10092,7 +9961,6 @@
           </w:tcPr>
           <w:p>
             <w:pPr>
-              <w:spacing w:after="0" w:line="240" w:lineRule="auto"/>
               <w:rPr>
                 <w:rFonts w:eastAsia="Times New Roman" w:hAnsi="Georgia" w:cs="Times New Roman"/>
                 <w:sz w:val="24"/>
@@ -10129,7 +9997,6 @@
           </w:tcPr>
           <w:p>
             <w:pPr>
-              <w:spacing w:after="0" w:line="240" w:lineRule="auto"/>
               <w:rPr>
                 <w:rFonts w:eastAsia="Times New Roman" w:hAnsi="Georgia" w:cs="Times New Roman"/>
                 <w:sz w:val="24"/>
@@ -10157,7 +10024,6 @@
           </w:tcPr>
           <w:p>
             <w:pPr>
-              <w:spacing w:after="0" w:line="240" w:lineRule="auto"/>
               <w:rPr>
                 <w:rFonts w:eastAsia="Times New Roman" w:hAnsi="Georgia" w:cs="Times New Roman"/>
                 <w:sz w:val="24"/>
@@ -10183,7 +10049,6 @@
           </w:tcPr>
           <w:p>
             <w:pPr>
-              <w:spacing w:after="0" w:line="240" w:lineRule="auto"/>
               <w:rPr>
                 <w:rFonts w:eastAsia="Times New Roman" w:hAnsi="Georgia" w:cs="Times New Roman"/>
                 <w:sz w:val="24"/>
@@ -10249,7 +10114,6 @@
           </w:tcPr>
           <w:p>
             <w:pPr>
-              <w:spacing w:after="0" w:line="240" w:lineRule="auto"/>
               <w:rPr>
                 <w:rFonts w:eastAsia="Times New Roman" w:hAnsi="Georgia" w:cs="Times New Roman"/>
                 <w:sz w:val="24"/>
@@ -10275,7 +10139,6 @@
           </w:tcPr>
           <w:p>
             <w:pPr>
-              <w:spacing w:after="0" w:line="240" w:lineRule="auto"/>
               <w:rPr>
                 <w:rFonts w:eastAsia="Times New Roman" w:hAnsi="Georgia" w:cs="Times New Roman"/>
                 <w:sz w:val="24"/>
@@ -10303,7 +10166,6 @@
           </w:tcPr>
           <w:p>
             <w:pPr>
-              <w:spacing w:after="0" w:line="240" w:lineRule="auto"/>
               <w:rPr>
                 <w:rFonts w:eastAsia="Times New Roman" w:hAnsi="Georgia" w:cs="Times New Roman"/>
                 <w:sz w:val="24"/>
@@ -10329,7 +10191,6 @@
           </w:tcPr>
           <w:p>
             <w:pPr>
-              <w:spacing w:after="0" w:line="240" w:lineRule="auto"/>
               <w:rPr>
                 <w:rFonts w:eastAsia="Times New Roman" w:hAnsi="Georgia" w:cs="Times New Roman"/>
                 <w:sz w:val="24"/>
@@ -10386,7 +10247,6 @@
           </w:tcPr>
           <w:p>
             <w:pPr>
-              <w:spacing w:after="0" w:line="240" w:lineRule="auto"/>
               <w:rPr>
                 <w:rFonts w:eastAsia="Times New Roman" w:hAnsi="Georgia" w:cs="Times New Roman"/>
                 <w:sz w:val="24"/>
@@ -10412,7 +10272,6 @@
           </w:tcPr>
           <w:p>
             <w:pPr>
-              <w:spacing w:after="0" w:line="240" w:lineRule="auto"/>
               <w:rPr>
                 <w:rFonts w:eastAsia="Times New Roman" w:hAnsi="Georgia" w:cs="Times New Roman"/>
                 <w:sz w:val="24"/>
@@ -10440,7 +10299,6 @@
           </w:tcPr>
           <w:p>
             <w:pPr>
-              <w:spacing w:after="0" w:line="240" w:lineRule="auto"/>
               <w:rPr>
                 <w:rFonts w:eastAsia="Times New Roman" w:hAnsi="Georgia" w:cs="Times New Roman"/>
                 <w:sz w:val="24"/>
@@ -10466,7 +10324,6 @@
           </w:tcPr>
           <w:p>
             <w:pPr>
-              <w:spacing w:after="0" w:line="240" w:lineRule="auto"/>
               <w:rPr>
                 <w:rFonts w:eastAsia="Times New Roman" w:hAnsi="Georgia" w:cs="Times New Roman"/>
                 <w:sz w:val="24"/>
@@ -10543,7 +10400,6 @@
           </w:tcPr>
           <w:p>
             <w:pPr>
-              <w:spacing w:after="0" w:line="240" w:lineRule="auto"/>
               <w:rPr>
                 <w:rFonts w:eastAsia="Times New Roman" w:hAnsi="Georgia" w:cs="Times New Roman"/>
                 <w:sz w:val="24"/>
@@ -10589,7 +10445,6 @@
           </w:tcPr>
           <w:p>
             <w:pPr>
-              <w:spacing w:after="0" w:line="240" w:lineRule="auto"/>
               <w:rPr>
                 <w:rFonts w:eastAsia="Times New Roman" w:hAnsi="Georgia" w:cs="Times New Roman"/>
                 <w:sz w:val="24"/>
@@ -11738,7 +11593,7 @@
 </file>
 
 <file path=word/endnotes.xml><?xml version="1.0" encoding="utf-8"?>
-<w:endnotes xmlns:wpc="http://schemas.microsoft.com/office/word/2010/wordprocessingCanvas" xmlns:cx="http://schemas.microsoft.com/office/drawing/2014/chartex" xmlns:cx1="http://schemas.microsoft.com/office/drawing/2015/9/8/chartex" xmlns:cx2="http://schemas.microsoft.com/office/drawing/2015/10/21/chartex" xmlns:cx3="http://schemas.microsoft.com/office/drawing/2016/5/9/chartex" xmlns:cx4="http://schemas.microsoft.com/office/drawing/2016/5/10/chartex" xmlns:cx5="http://schemas.microsoft.com/office/drawing/2016/5/11/chartex" xmlns:cx6="http://schemas.microsoft.com/office/drawing/2016/5/12/chartex" xmlns:cx7="http://schemas.microsoft.com/office/drawing/2016/5/13/chartex" xmlns:cx8="http://schemas.microsoft.com/office/drawing/2016/5/14/chartex" xmlns:mc="http://schemas.openxmlformats.org/markup-compatibility/2006" xmlns:aink="http://schemas.microsoft.com/office/drawing/2016/ink" xmlns:am3d="http://schemas.microsoft.com/office/drawing/2017/model3d" xmlns:o="urn:schemas-microsoft-com:office:office" xmlns:oel="http://schemas.microsoft.com/office/2019/extlst" xmlns:r="http://schemas.openxmlformats.org/officeDocument/2006/relationships" xmlns:m="http://schemas.openxmlformats.org/officeDocument/2006/math" xmlns:v="urn:schemas-microsoft-com:vml" xmlns:wp14="http://schemas.microsoft.com/office/word/2010/wordprocessingDrawing" xmlns:wp="http://schemas.openxmlformats.org/drawingml/2006/wordprocessingDrawing" xmlns:w10="urn:schemas-microsoft-com:office:word" xmlns:w="http://schemas.openxmlformats.org/wordprocessingml/2006/main" xmlns:w14="http://schemas.microsoft.com/office/word/2010/wordml" xmlns:w15="http://schemas.microsoft.com/office/word/2012/wordml" xmlns:w16cex="http://schemas.microsoft.com/office/word/2018/wordml/cex" xmlns:w16cid="http://schemas.microsoft.com/office/word/2016/wordml/cid" xmlns:w16="http://schemas.microsoft.com/office/word/2018/wordml" xmlns:w16du="http://schemas.microsoft.com/office/word/2023/wordml/word16du" xmlns:w16sdtdh="http://schemas.microsoft.com/office/word/2020/wordml/sdtdatahash" xmlns:w16se="http://schemas.microsoft.com/office/word/2015/wordml/symex" xmlns:wpg="http://schemas.microsoft.com/office/word/2010/wordprocessingGroup" xmlns:wpi="http://schemas.microsoft.com/office/word/2010/wordprocessingInk" xmlns:wne="http://schemas.microsoft.com/office/word/2006/wordml" xmlns:wps="http://schemas.microsoft.com/office/word/2010/wordprocessingShape" mc:Ignorable="w14 w15 w16se w16cid w16 w16cex w16sdtdh wp14">
+<w:endnotes xmlns:wpc="http://schemas.microsoft.com/office/word/2010/wordprocessingCanvas" xmlns:cx="http://schemas.microsoft.com/office/drawing/2014/chartex" xmlns:cx1="http://schemas.microsoft.com/office/drawing/2015/9/8/chartex" xmlns:cx2="http://schemas.microsoft.com/office/drawing/2015/10/21/chartex" xmlns:cx3="http://schemas.microsoft.com/office/drawing/2016/5/9/chartex" xmlns:cx4="http://schemas.microsoft.com/office/drawing/2016/5/10/chartex" xmlns:cx5="http://schemas.microsoft.com/office/drawing/2016/5/11/chartex" xmlns:cx6="http://schemas.microsoft.com/office/drawing/2016/5/12/chartex" xmlns:cx7="http://schemas.microsoft.com/office/drawing/2016/5/13/chartex" xmlns:cx8="http://schemas.microsoft.com/office/drawing/2016/5/14/chartex" xmlns:mc="http://schemas.openxmlformats.org/markup-compatibility/2006" xmlns:aink="http://schemas.microsoft.com/office/drawing/2016/ink" xmlns:am3d="http://schemas.microsoft.com/office/drawing/2017/model3d" xmlns:o="urn:schemas-microsoft-com:office:office" xmlns:r="http://schemas.openxmlformats.org/officeDocument/2006/relationships" xmlns:m="http://schemas.openxmlformats.org/officeDocument/2006/math" xmlns:v="urn:schemas-microsoft-com:vml" xmlns:wp14="http://schemas.microsoft.com/office/word/2010/wordprocessingDrawing" xmlns:wp="http://schemas.openxmlformats.org/drawingml/2006/wordprocessingDrawing" xmlns:w10="urn:schemas-microsoft-com:office:word" xmlns:w="http://schemas.openxmlformats.org/wordprocessingml/2006/main" xmlns:w14="http://schemas.microsoft.com/office/word/2010/wordml" xmlns:w15="http://schemas.microsoft.com/office/word/2012/wordml" xmlns:w16cex="http://schemas.microsoft.com/office/word/2018/wordml/cex" xmlns:w16cid="http://schemas.microsoft.com/office/word/2016/wordml/cid" xmlns:w16="http://schemas.microsoft.com/office/word/2018/wordml" xmlns:w16sdtdh="http://schemas.microsoft.com/office/word/2020/wordml/sdtdatahash" xmlns:w16se="http://schemas.microsoft.com/office/word/2015/wordml/symex" xmlns:wpg="http://schemas.microsoft.com/office/word/2010/wordprocessingGroup" xmlns:wpi="http://schemas.microsoft.com/office/word/2010/wordprocessingInk" xmlns:wne="http://schemas.microsoft.com/office/word/2006/wordml" xmlns:wps="http://schemas.microsoft.com/office/word/2010/wordprocessingShape" mc:Ignorable="w14 w15 w16se w16cid w16 w16cex w16sdtdh wp14">
   <w:endnote w:type="separator" w:id="-1">
     <w:p>
       <w:pPr>
@@ -11763,7 +11618,7 @@
 </file>
 
 <file path=word/footer1.xml><?xml version="1.0" encoding="utf-8"?>
-<w:ftr xmlns:wpc="http://schemas.microsoft.com/office/word/2010/wordprocessingCanvas" xmlns:cx="http://schemas.microsoft.com/office/drawing/2014/chartex" xmlns:cx1="http://schemas.microsoft.com/office/drawing/2015/9/8/chartex" xmlns:cx2="http://schemas.microsoft.com/office/drawing/2015/10/21/chartex" xmlns:cx3="http://schemas.microsoft.com/office/drawing/2016/5/9/chartex" xmlns:cx4="http://schemas.microsoft.com/office/drawing/2016/5/10/chartex" xmlns:cx5="http://schemas.microsoft.com/office/drawing/2016/5/11/chartex" xmlns:cx6="http://schemas.microsoft.com/office/drawing/2016/5/12/chartex" xmlns:cx7="http://schemas.microsoft.com/office/drawing/2016/5/13/chartex" xmlns:cx8="http://schemas.microsoft.com/office/drawing/2016/5/14/chartex" xmlns:mc="http://schemas.openxmlformats.org/markup-compatibility/2006" xmlns:aink="http://schemas.microsoft.com/office/drawing/2016/ink" xmlns:am3d="http://schemas.microsoft.com/office/drawing/2017/model3d" xmlns:o="urn:schemas-microsoft-com:office:office" xmlns:oel="http://schemas.microsoft.com/office/2019/extlst" xmlns:r="http://schemas.openxmlformats.org/officeDocument/2006/relationships" xmlns:m="http://schemas.openxmlformats.org/officeDocument/2006/math" xmlns:v="urn:schemas-microsoft-com:vml" xmlns:wp14="http://schemas.microsoft.com/office/word/2010/wordprocessingDrawing" xmlns:wp="http://schemas.openxmlformats.org/drawingml/2006/wordprocessingDrawing" xmlns:w10="urn:schemas-microsoft-com:office:word" xmlns:w="http://schemas.openxmlformats.org/wordprocessingml/2006/main" xmlns:w14="http://schemas.microsoft.com/office/word/2010/wordml" xmlns:w15="http://schemas.microsoft.com/office/word/2012/wordml" xmlns:w16cex="http://schemas.microsoft.com/office/word/2018/wordml/cex" xmlns:w16cid="http://schemas.microsoft.com/office/word/2016/wordml/cid" xmlns:w16="http://schemas.microsoft.com/office/word/2018/wordml" xmlns:w16du="http://schemas.microsoft.com/office/word/2023/wordml/word16du" xmlns:w16sdtdh="http://schemas.microsoft.com/office/word/2020/wordml/sdtdatahash" xmlns:w16se="http://schemas.microsoft.com/office/word/2015/wordml/symex" xmlns:wpg="http://schemas.microsoft.com/office/word/2010/wordprocessingGroup" xmlns:wpi="http://schemas.microsoft.com/office/word/2010/wordprocessingInk" xmlns:wne="http://schemas.microsoft.com/office/word/2006/wordml" xmlns:wps="http://schemas.microsoft.com/office/word/2010/wordprocessingShape" mc:Ignorable="w14 w15 w16se w16cid w16 w16cex w16sdtdh wp14">
+<w:ftr xmlns:wpc="http://schemas.microsoft.com/office/word/2010/wordprocessingCanvas" xmlns:cx="http://schemas.microsoft.com/office/drawing/2014/chartex" xmlns:cx1="http://schemas.microsoft.com/office/drawing/2015/9/8/chartex" xmlns:cx2="http://schemas.microsoft.com/office/drawing/2015/10/21/chartex" xmlns:cx3="http://schemas.microsoft.com/office/drawing/2016/5/9/chartex" xmlns:cx4="http://schemas.microsoft.com/office/drawing/2016/5/10/chartex" xmlns:cx5="http://schemas.microsoft.com/office/drawing/2016/5/11/chartex" xmlns:cx6="http://schemas.microsoft.com/office/drawing/2016/5/12/chartex" xmlns:cx7="http://schemas.microsoft.com/office/drawing/2016/5/13/chartex" xmlns:cx8="http://schemas.microsoft.com/office/drawing/2016/5/14/chartex" xmlns:mc="http://schemas.openxmlformats.org/markup-compatibility/2006" xmlns:aink="http://schemas.microsoft.com/office/drawing/2016/ink" xmlns:am3d="http://schemas.microsoft.com/office/drawing/2017/model3d" xmlns:o="urn:schemas-microsoft-com:office:office" xmlns:r="http://schemas.openxmlformats.org/officeDocument/2006/relationships" xmlns:m="http://schemas.openxmlformats.org/officeDocument/2006/math" xmlns:v="urn:schemas-microsoft-com:vml" xmlns:wp14="http://schemas.microsoft.com/office/word/2010/wordprocessingDrawing" xmlns:wp="http://schemas.openxmlformats.org/drawingml/2006/wordprocessingDrawing" xmlns:w10="urn:schemas-microsoft-com:office:word" xmlns:w="http://schemas.openxmlformats.org/wordprocessingml/2006/main" xmlns:w14="http://schemas.microsoft.com/office/word/2010/wordml" xmlns:w15="http://schemas.microsoft.com/office/word/2012/wordml" xmlns:w16cex="http://schemas.microsoft.com/office/word/2018/wordml/cex" xmlns:w16cid="http://schemas.microsoft.com/office/word/2016/wordml/cid" xmlns:w16="http://schemas.microsoft.com/office/word/2018/wordml" xmlns:w16sdtdh="http://schemas.microsoft.com/office/word/2020/wordml/sdtdatahash" xmlns:w16se="http://schemas.microsoft.com/office/word/2015/wordml/symex" xmlns:wpg="http://schemas.microsoft.com/office/word/2010/wordprocessingGroup" xmlns:wpi="http://schemas.microsoft.com/office/word/2010/wordprocessingInk" xmlns:wne="http://schemas.microsoft.com/office/word/2006/wordml" xmlns:wps="http://schemas.microsoft.com/office/word/2010/wordprocessingShape" mc:Ignorable="w14 w15 w16se w16cid w16 w16cex w16sdtdh wp14">
   <w:sdt>
     <w:sdtPr>
       <w:id w:val="1034072369"/>
@@ -11772,6 +11627,7 @@
         <w:docPartUnique/>
       </w:docPartObj>
     </w:sdtPr>
+    <w:sdtEndPr/>
     <w:sdtContent>
       <w:p>
         <w:pPr>
@@ -11805,7 +11661,7 @@
 </file>
 
 <file path=word/footnotes.xml><?xml version="1.0" encoding="utf-8"?>
-<w:footnotes xmlns:wpc="http://schemas.microsoft.com/office/word/2010/wordprocessingCanvas" xmlns:cx="http://schemas.microsoft.com/office/drawing/2014/chartex" xmlns:cx1="http://schemas.microsoft.com/office/drawing/2015/9/8/chartex" xmlns:cx2="http://schemas.microsoft.com/office/drawing/2015/10/21/chartex" xmlns:cx3="http://schemas.microsoft.com/office/drawing/2016/5/9/chartex" xmlns:cx4="http://schemas.microsoft.com/office/drawing/2016/5/10/chartex" xmlns:cx5="http://schemas.microsoft.com/office/drawing/2016/5/11/chartex" xmlns:cx6="http://schemas.microsoft.com/office/drawing/2016/5/12/chartex" xmlns:cx7="http://schemas.microsoft.com/office/drawing/2016/5/13/chartex" xmlns:cx8="http://schemas.microsoft.com/office/drawing/2016/5/14/chartex" xmlns:mc="http://schemas.openxmlformats.org/markup-compatibility/2006" xmlns:aink="http://schemas.microsoft.com/office/drawing/2016/ink" xmlns:am3d="http://schemas.microsoft.com/office/drawing/2017/model3d" xmlns:o="urn:schemas-microsoft-com:office:office" xmlns:oel="http://schemas.microsoft.com/office/2019/extlst" xmlns:r="http://schemas.openxmlformats.org/officeDocument/2006/relationships" xmlns:m="http://schemas.openxmlformats.org/officeDocument/2006/math" xmlns:v="urn:schemas-microsoft-com:vml" xmlns:wp14="http://schemas.microsoft.com/office/word/2010/wordprocessingDrawing" xmlns:wp="http://schemas.openxmlformats.org/drawingml/2006/wordprocessingDrawing" xmlns:w10="urn:schemas-microsoft-com:office:word" xmlns:w="http://schemas.openxmlformats.org/wordprocessingml/2006/main" xmlns:w14="http://schemas.microsoft.com/office/word/2010/wordml" xmlns:w15="http://schemas.microsoft.com/office/word/2012/wordml" xmlns:w16cex="http://schemas.microsoft.com/office/word/2018/wordml/cex" xmlns:w16cid="http://schemas.microsoft.com/office/word/2016/wordml/cid" xmlns:w16="http://schemas.microsoft.com/office/word/2018/wordml" xmlns:w16du="http://schemas.microsoft.com/office/word/2023/wordml/word16du" xmlns:w16sdtdh="http://schemas.microsoft.com/office/word/2020/wordml/sdtdatahash" xmlns:w16se="http://schemas.microsoft.com/office/word/2015/wordml/symex" xmlns:wpg="http://schemas.microsoft.com/office/word/2010/wordprocessingGroup" xmlns:wpi="http://schemas.microsoft.com/office/word/2010/wordprocessingInk" xmlns:wne="http://schemas.microsoft.com/office/word/2006/wordml" xmlns:wps="http://schemas.microsoft.com/office/word/2010/wordprocessingShape" mc:Ignorable="w14 w15 w16se w16cid w16 w16cex w16sdtdh wp14">
+<w:footnotes xmlns:wpc="http://schemas.microsoft.com/office/word/2010/wordprocessingCanvas" xmlns:cx="http://schemas.microsoft.com/office/drawing/2014/chartex" xmlns:cx1="http://schemas.microsoft.com/office/drawing/2015/9/8/chartex" xmlns:cx2="http://schemas.microsoft.com/office/drawing/2015/10/21/chartex" xmlns:cx3="http://schemas.microsoft.com/office/drawing/2016/5/9/chartex" xmlns:cx4="http://schemas.microsoft.com/office/drawing/2016/5/10/chartex" xmlns:cx5="http://schemas.microsoft.com/office/drawing/2016/5/11/chartex" xmlns:cx6="http://schemas.microsoft.com/office/drawing/2016/5/12/chartex" xmlns:cx7="http://schemas.microsoft.com/office/drawing/2016/5/13/chartex" xmlns:cx8="http://schemas.microsoft.com/office/drawing/2016/5/14/chartex" xmlns:mc="http://schemas.openxmlformats.org/markup-compatibility/2006" xmlns:aink="http://schemas.microsoft.com/office/drawing/2016/ink" xmlns:am3d="http://schemas.microsoft.com/office/drawing/2017/model3d" xmlns:o="urn:schemas-microsoft-com:office:office" xmlns:r="http://schemas.openxmlformats.org/officeDocument/2006/relationships" xmlns:m="http://schemas.openxmlformats.org/officeDocument/2006/math" xmlns:v="urn:schemas-microsoft-com:vml" xmlns:wp14="http://schemas.microsoft.com/office/word/2010/wordprocessingDrawing" xmlns:wp="http://schemas.openxmlformats.org/drawingml/2006/wordprocessingDrawing" xmlns:w10="urn:schemas-microsoft-com:office:word" xmlns:w="http://schemas.openxmlformats.org/wordprocessingml/2006/main" xmlns:w14="http://schemas.microsoft.com/office/word/2010/wordml" xmlns:w15="http://schemas.microsoft.com/office/word/2012/wordml" xmlns:w16cex="http://schemas.microsoft.com/office/word/2018/wordml/cex" xmlns:w16cid="http://schemas.microsoft.com/office/word/2016/wordml/cid" xmlns:w16="http://schemas.microsoft.com/office/word/2018/wordml" xmlns:w16sdtdh="http://schemas.microsoft.com/office/word/2020/wordml/sdtdatahash" xmlns:w16se="http://schemas.microsoft.com/office/word/2015/wordml/symex" xmlns:wpg="http://schemas.microsoft.com/office/word/2010/wordprocessingGroup" xmlns:wpi="http://schemas.microsoft.com/office/word/2010/wordprocessingInk" xmlns:wne="http://schemas.microsoft.com/office/word/2006/wordml" xmlns:wps="http://schemas.microsoft.com/office/word/2010/wordprocessingShape" mc:Ignorable="w14 w15 w16se w16cid w16 w16cex w16sdtdh wp14">
   <w:footnote w:type="separator" w:id="-1">
     <w:p>
       <w:pPr>
@@ -11830,7 +11686,7 @@
 </file>
 
 <file path=word/header1.xml><?xml version="1.0" encoding="utf-8"?>
-<w:hdr xmlns:wpc="http://schemas.microsoft.com/office/word/2010/wordprocessingCanvas" xmlns:cx="http://schemas.microsoft.com/office/drawing/2014/chartex" xmlns:cx1="http://schemas.microsoft.com/office/drawing/2015/9/8/chartex" xmlns:cx2="http://schemas.microsoft.com/office/drawing/2015/10/21/chartex" xmlns:cx3="http://schemas.microsoft.com/office/drawing/2016/5/9/chartex" xmlns:cx4="http://schemas.microsoft.com/office/drawing/2016/5/10/chartex" xmlns:cx5="http://schemas.microsoft.com/office/drawing/2016/5/11/chartex" xmlns:cx6="http://schemas.microsoft.com/office/drawing/2016/5/12/chartex" xmlns:cx7="http://schemas.microsoft.com/office/drawing/2016/5/13/chartex" xmlns:cx8="http://schemas.microsoft.com/office/drawing/2016/5/14/chartex" xmlns:mc="http://schemas.openxmlformats.org/markup-compatibility/2006" xmlns:aink="http://schemas.microsoft.com/office/drawing/2016/ink" xmlns:am3d="http://schemas.microsoft.com/office/drawing/2017/model3d" xmlns:o="urn:schemas-microsoft-com:office:office" xmlns:oel="http://schemas.microsoft.com/office/2019/extlst" xmlns:r="http://schemas.openxmlformats.org/officeDocument/2006/relationships" xmlns:m="http://schemas.openxmlformats.org/officeDocument/2006/math" xmlns:v="urn:schemas-microsoft-com:vml" xmlns:wp14="http://schemas.microsoft.com/office/word/2010/wordprocessingDrawing" xmlns:wp="http://schemas.openxmlformats.org/drawingml/2006/wordprocessingDrawing" xmlns:w10="urn:schemas-microsoft-com:office:word" xmlns:w="http://schemas.openxmlformats.org/wordprocessingml/2006/main" xmlns:w14="http://schemas.microsoft.com/office/word/2010/wordml" xmlns:w15="http://schemas.microsoft.com/office/word/2012/wordml" xmlns:w16cex="http://schemas.microsoft.com/office/word/2018/wordml/cex" xmlns:w16cid="http://schemas.microsoft.com/office/word/2016/wordml/cid" xmlns:w16="http://schemas.microsoft.com/office/word/2018/wordml" xmlns:w16du="http://schemas.microsoft.com/office/word/2023/wordml/word16du" xmlns:w16sdtdh="http://schemas.microsoft.com/office/word/2020/wordml/sdtdatahash" xmlns:w16se="http://schemas.microsoft.com/office/word/2015/wordml/symex" xmlns:wpg="http://schemas.microsoft.com/office/word/2010/wordprocessingGroup" xmlns:wpi="http://schemas.microsoft.com/office/word/2010/wordprocessingInk" xmlns:wne="http://schemas.microsoft.com/office/word/2006/wordml" xmlns:wps="http://schemas.microsoft.com/office/word/2010/wordprocessingShape" mc:Ignorable="w14 w15 w16se w16cid w16 w16cex w16sdtdh wp14">
+<w:hdr xmlns:wpc="http://schemas.microsoft.com/office/word/2010/wordprocessingCanvas" xmlns:cx="http://schemas.microsoft.com/office/drawing/2014/chartex" xmlns:cx1="http://schemas.microsoft.com/office/drawing/2015/9/8/chartex" xmlns:cx2="http://schemas.microsoft.com/office/drawing/2015/10/21/chartex" xmlns:cx3="http://schemas.microsoft.com/office/drawing/2016/5/9/chartex" xmlns:cx4="http://schemas.microsoft.com/office/drawing/2016/5/10/chartex" xmlns:cx5="http://schemas.microsoft.com/office/drawing/2016/5/11/chartex" xmlns:cx6="http://schemas.microsoft.com/office/drawing/2016/5/12/chartex" xmlns:cx7="http://schemas.microsoft.com/office/drawing/2016/5/13/chartex" xmlns:cx8="http://schemas.microsoft.com/office/drawing/2016/5/14/chartex" xmlns:mc="http://schemas.openxmlformats.org/markup-compatibility/2006" xmlns:aink="http://schemas.microsoft.com/office/drawing/2016/ink" xmlns:am3d="http://schemas.microsoft.com/office/drawing/2017/model3d" xmlns:o="urn:schemas-microsoft-com:office:office" xmlns:r="http://schemas.openxmlformats.org/officeDocument/2006/relationships" xmlns:m="http://schemas.openxmlformats.org/officeDocument/2006/math" xmlns:v="urn:schemas-microsoft-com:vml" xmlns:wp14="http://schemas.microsoft.com/office/word/2010/wordprocessingDrawing" xmlns:wp="http://schemas.openxmlformats.org/drawingml/2006/wordprocessingDrawing" xmlns:w10="urn:schemas-microsoft-com:office:word" xmlns:w="http://schemas.openxmlformats.org/wordprocessingml/2006/main" xmlns:w14="http://schemas.microsoft.com/office/word/2010/wordml" xmlns:w15="http://schemas.microsoft.com/office/word/2012/wordml" xmlns:w16cex="http://schemas.microsoft.com/office/word/2018/wordml/cex" xmlns:w16cid="http://schemas.microsoft.com/office/word/2016/wordml/cid" xmlns:w16="http://schemas.microsoft.com/office/word/2018/wordml" xmlns:w16sdtdh="http://schemas.microsoft.com/office/word/2020/wordml/sdtdatahash" xmlns:w16se="http://schemas.microsoft.com/office/word/2015/wordml/symex" xmlns:wpg="http://schemas.microsoft.com/office/word/2010/wordprocessingGroup" xmlns:wpi="http://schemas.microsoft.com/office/word/2010/wordprocessingInk" xmlns:wne="http://schemas.microsoft.com/office/word/2006/wordml" xmlns:wps="http://schemas.microsoft.com/office/word/2010/wordprocessingShape" mc:Ignorable="w14 w15 w16se w16cid w16 w16cex w16sdtdh wp14">
   <w:p>
     <w:pPr>
       <w:pStyle w:val="Encabezado"/>
@@ -11846,7 +11702,7 @@
 </file>
 
 <file path=word/numbering.xml><?xml version="1.0" encoding="utf-8"?>
-<w:numbering xmlns:wpc="http://schemas.microsoft.com/office/word/2010/wordprocessingCanvas" xmlns:cx="http://schemas.microsoft.com/office/drawing/2014/chartex" xmlns:cx1="http://schemas.microsoft.com/office/drawing/2015/9/8/chartex" xmlns:cx2="http://schemas.microsoft.com/office/drawing/2015/10/21/chartex" xmlns:cx3="http://schemas.microsoft.com/office/drawing/2016/5/9/chartex" xmlns:cx4="http://schemas.microsoft.com/office/drawing/2016/5/10/chartex" xmlns:cx5="http://schemas.microsoft.com/office/drawing/2016/5/11/chartex" xmlns:cx6="http://schemas.microsoft.com/office/drawing/2016/5/12/chartex" xmlns:cx7="http://schemas.microsoft.com/office/drawing/2016/5/13/chartex" xmlns:cx8="http://schemas.microsoft.com/office/drawing/2016/5/14/chartex" xmlns:mc="http://schemas.openxmlformats.org/markup-compatibility/2006" xmlns:aink="http://schemas.microsoft.com/office/drawing/2016/ink" xmlns:am3d="http://schemas.microsoft.com/office/drawing/2017/model3d" xmlns:o="urn:schemas-microsoft-com:office:office" xmlns:oel="http://schemas.microsoft.com/office/2019/extlst" xmlns:r="http://schemas.openxmlformats.org/officeDocument/2006/relationships" xmlns:m="http://schemas.openxmlformats.org/officeDocument/2006/math" xmlns:v="urn:schemas-microsoft-com:vml" xmlns:wp14="http://schemas.microsoft.com/office/word/2010/wordprocessingDrawing" xmlns:wp="http://schemas.openxmlformats.org/drawingml/2006/wordprocessingDrawing" xmlns:w10="urn:schemas-microsoft-com:office:word" xmlns:w="http://schemas.openxmlformats.org/wordprocessingml/2006/main" xmlns:w14="http://schemas.microsoft.com/office/word/2010/wordml" xmlns:w15="http://schemas.microsoft.com/office/word/2012/wordml" xmlns:w16cex="http://schemas.microsoft.com/office/word/2018/wordml/cex" xmlns:w16cid="http://schemas.microsoft.com/office/word/2016/wordml/cid" xmlns:w16="http://schemas.microsoft.com/office/word/2018/wordml" xmlns:w16du="http://schemas.microsoft.com/office/word/2023/wordml/word16du" xmlns:w16sdtdh="http://schemas.microsoft.com/office/word/2020/wordml/sdtdatahash" xmlns:w16se="http://schemas.microsoft.com/office/word/2015/wordml/symex" xmlns:wpg="http://schemas.microsoft.com/office/word/2010/wordprocessingGroup" xmlns:wpi="http://schemas.microsoft.com/office/word/2010/wordprocessingInk" xmlns:wne="http://schemas.microsoft.com/office/word/2006/wordml" xmlns:wps="http://schemas.microsoft.com/office/word/2010/wordprocessingShape" mc:Ignorable="w14 w15 w16se w16cid w16 w16cex w16sdtdh wp14">
+<w:numbering xmlns:wpc="http://schemas.microsoft.com/office/word/2010/wordprocessingCanvas" xmlns:cx="http://schemas.microsoft.com/office/drawing/2014/chartex" xmlns:cx1="http://schemas.microsoft.com/office/drawing/2015/9/8/chartex" xmlns:cx2="http://schemas.microsoft.com/office/drawing/2015/10/21/chartex" xmlns:cx3="http://schemas.microsoft.com/office/drawing/2016/5/9/chartex" xmlns:cx4="http://schemas.microsoft.com/office/drawing/2016/5/10/chartex" xmlns:cx5="http://schemas.microsoft.com/office/drawing/2016/5/11/chartex" xmlns:cx6="http://schemas.microsoft.com/office/drawing/2016/5/12/chartex" xmlns:cx7="http://schemas.microsoft.com/office/drawing/2016/5/13/chartex" xmlns:cx8="http://schemas.microsoft.com/office/drawing/2016/5/14/chartex" xmlns:mc="http://schemas.openxmlformats.org/markup-compatibility/2006" xmlns:aink="http://schemas.microsoft.com/office/drawing/2016/ink" xmlns:am3d="http://schemas.microsoft.com/office/drawing/2017/model3d" xmlns:o="urn:schemas-microsoft-com:office:office" xmlns:r="http://schemas.openxmlformats.org/officeDocument/2006/relationships" xmlns:m="http://schemas.openxmlformats.org/officeDocument/2006/math" xmlns:v="urn:schemas-microsoft-com:vml" xmlns:wp14="http://schemas.microsoft.com/office/word/2010/wordprocessingDrawing" xmlns:wp="http://schemas.openxmlformats.org/drawingml/2006/wordprocessingDrawing" xmlns:w10="urn:schemas-microsoft-com:office:word" xmlns:w="http://schemas.openxmlformats.org/wordprocessingml/2006/main" xmlns:w14="http://schemas.microsoft.com/office/word/2010/wordml" xmlns:w15="http://schemas.microsoft.com/office/word/2012/wordml" xmlns:w16cex="http://schemas.microsoft.com/office/word/2018/wordml/cex" xmlns:w16cid="http://schemas.microsoft.com/office/word/2016/wordml/cid" xmlns:w16="http://schemas.microsoft.com/office/word/2018/wordml" xmlns:w16sdtdh="http://schemas.microsoft.com/office/word/2020/wordml/sdtdatahash" xmlns:w16se="http://schemas.microsoft.com/office/word/2015/wordml/symex" xmlns:wpg="http://schemas.microsoft.com/office/word/2010/wordprocessingGroup" xmlns:wpi="http://schemas.microsoft.com/office/word/2010/wordprocessingInk" xmlns:wne="http://schemas.microsoft.com/office/word/2006/wordml" xmlns:wps="http://schemas.microsoft.com/office/word/2010/wordprocessingShape" mc:Ignorable="w14 w15 w16se w16cid w16 w16cex w16sdtdh wp14">
   <w:abstractNum w:abstractNumId="0" w15:restartNumberingAfterBreak="0">
     <w:nsid w:val="08903CC5"/>
     <w:multiLevelType w:val="hybridMultilevel"/>
@@ -12700,34 +12556,34 @@
       <w:lvlJc w:val="left"/>
     </w:lvl>
   </w:abstractNum>
-  <w:num w:numId="1" w16cid:durableId="2011061686">
+  <w:num w:numId="1">
     <w:abstractNumId w:val="3"/>
   </w:num>
-  <w:num w:numId="2" w16cid:durableId="342708125">
+  <w:num w:numId="2">
     <w:abstractNumId w:val="8"/>
   </w:num>
-  <w:num w:numId="3" w16cid:durableId="2122726897">
+  <w:num w:numId="3">
     <w:abstractNumId w:val="1"/>
   </w:num>
-  <w:num w:numId="4" w16cid:durableId="1150099583">
+  <w:num w:numId="4">
     <w:abstractNumId w:val="0"/>
   </w:num>
-  <w:num w:numId="5" w16cid:durableId="751586741">
+  <w:num w:numId="5">
     <w:abstractNumId w:val="5"/>
   </w:num>
-  <w:num w:numId="6" w16cid:durableId="368838426">
+  <w:num w:numId="6">
     <w:abstractNumId w:val="9"/>
   </w:num>
-  <w:num w:numId="7" w16cid:durableId="1129281147">
+  <w:num w:numId="7">
     <w:abstractNumId w:val="6"/>
   </w:num>
-  <w:num w:numId="8" w16cid:durableId="278999975">
+  <w:num w:numId="8">
     <w:abstractNumId w:val="7"/>
   </w:num>
-  <w:num w:numId="9" w16cid:durableId="997684060">
+  <w:num w:numId="9">
     <w:abstractNumId w:val="4"/>
   </w:num>
-  <w:num w:numId="10" w16cid:durableId="1554928912">
+  <w:num w:numId="10">
     <w:abstractNumId w:val="2"/>
   </w:num>
 </w:numbering>
@@ -13156,6 +13012,7 @@
   <w:style w:type="character" w:default="1" w:styleId="Fuentedeprrafopredeter">
     <w:name w:val="Default Paragraph Font"/>
     <w:uiPriority w:val="1"/>
+    <w:semiHidden/>
     <w:unhideWhenUsed/>
   </w:style>
   <w:style w:type="table" w:default="1" w:styleId="Tablanormal">

</xml_diff>